<commit_message>
chore: cap nhat tai lieu va script phu tro
</commit_message>
<xml_diff>
--- a/reports/tai-lieu-du-an-nhom-01.docx
+++ b/reports/tai-lieu-du-an-nhom-01.docx
@@ -2387,107 +2387,33 @@
     </w:p>
     <w:p>
       <w:pPr>
+        <w:tabs>
+          <w:tab w:val="center" w:pos="4550"/>
+        </w:tabs>
+        <w:ind w:left="650" w:right="492" w:hanging="650"/>
         <w:jc w:val="center"/>
         <w:rPr>
           <w:b/>
-          <w:sz w:val="16"/>
+          <w:sz w:val="32"/>
+          <w:szCs w:val="34"/>
         </w:rPr>
       </w:pPr>
-    </w:p>
-    <w:p>
-      <w:pPr>
-        <w:jc w:val="center"/>
+      <w:r>
         <w:rPr>
           <w:b/>
-          <w:sz w:val="16"/>
-        </w:rPr>
-      </w:pPr>
+          <w:sz w:val="32"/>
+          <w:szCs w:val="34"/>
+        </w:rPr>
+        <w:t xml:space="preserve">BÁO CÁO DỰ ÁN </w:t>
+      </w:r>
       <w:r>
         <w:rPr>
           <w:b/>
-          <w:noProof/>
-          <w:sz w:val="16"/>
-        </w:rPr>
-        <w:drawing>
-          <wp:inline distT="0" distB="0" distL="0" distR="0" wp14:anchorId="22CC20BB" wp14:editId="031EDE6A">
-            <wp:extent cx="2057400" cy="714375"/>
-            <wp:effectExtent l="0" t="0" r="0" b="0"/>
-            <wp:docPr id="1" name="Google Shape;19;p15"/>
-            <wp:cNvGraphicFramePr>
-              <a:graphicFrameLocks xmlns:a="http://schemas.openxmlformats.org/drawingml/2006/main" noChangeAspect="1"/>
-            </wp:cNvGraphicFramePr>
-            <a:graphic xmlns:a="http://schemas.openxmlformats.org/drawingml/2006/main">
-              <a:graphicData uri="http://schemas.openxmlformats.org/drawingml/2006/picture">
-                <pic:pic xmlns:pic="http://schemas.openxmlformats.org/drawingml/2006/picture">
-                  <pic:nvPicPr>
-                    <pic:cNvPr id="0" name="Google Shape;19;p15"/>
-                    <pic:cNvPicPr>
-                      <a:picLocks noChangeAspect="1" noChangeArrowheads="1"/>
-                    </pic:cNvPicPr>
-                  </pic:nvPicPr>
-                  <pic:blipFill>
-                    <a:blip r:embed="rId7">
-                      <a:extLst>
-                        <a:ext uri="{28A0092B-C50C-407E-A947-70E740481C1C}">
-                          <a14:useLocalDpi xmlns:a14="http://schemas.microsoft.com/office/drawing/2010/main" val="0"/>
-                        </a:ext>
-                      </a:extLst>
-                    </a:blip>
-                    <a:srcRect/>
-                    <a:stretch>
-                      <a:fillRect/>
-                    </a:stretch>
-                  </pic:blipFill>
-                  <pic:spPr bwMode="auto">
-                    <a:xfrm>
-                      <a:off x="0" y="0"/>
-                      <a:ext cx="2057400" cy="714375"/>
-                    </a:xfrm>
-                    <a:prstGeom prst="rect">
-                      <a:avLst/>
-                    </a:prstGeom>
-                    <a:noFill/>
-                    <a:ln>
-                      <a:noFill/>
-                    </a:ln>
-                  </pic:spPr>
-                </pic:pic>
-              </a:graphicData>
-            </a:graphic>
-          </wp:inline>
-        </w:drawing>
-      </w:r>
-    </w:p>
-    <w:p>
-      <w:pPr>
-        <w:jc w:val="center"/>
-        <w:rPr>
-          <w:b/>
-          <w:sz w:val="16"/>
-        </w:rPr>
-      </w:pPr>
-    </w:p>
-    <w:p>
-      <w:pPr>
-        <w:jc w:val="center"/>
-        <w:rPr>
-          <w:b/>
-          <w:sz w:val="16"/>
-        </w:rPr>
-      </w:pPr>
-    </w:p>
-    <w:p>
-      <w:pPr>
-        <w:tabs>
-          <w:tab w:val="left" w:pos="650"/>
-        </w:tabs>
-        <w:jc w:val="center"/>
-        <w:rPr>
-          <w:b/>
-          <w:sz w:val="38"/>
-          <w:szCs w:val="38"/>
-        </w:rPr>
-      </w:pPr>
+          <w:sz w:val="32"/>
+          <w:szCs w:val="34"/>
+        </w:rPr>
+        <w:t>1</w:t>
+      </w:r>
     </w:p>
     <w:p>
       <w:pPr>
@@ -2498,60 +2424,18 @@
         <w:jc w:val="center"/>
         <w:rPr>
           <w:b/>
-          <w:sz w:val="32"/>
+          <w:sz w:val="38"/>
           <w:szCs w:val="34"/>
         </w:rPr>
       </w:pPr>
       <w:r>
-        <w:rPr>
-          <w:b/>
-          <w:sz w:val="32"/>
-          <w:szCs w:val="34"/>
-        </w:rPr>
-        <w:t xml:space="preserve">BÁO CÁO DỰ ÁN </w:t>
-      </w:r>
-      <w:r>
-        <w:rPr>
-          <w:b/>
-          <w:sz w:val="32"/>
-          <w:szCs w:val="34"/>
-        </w:rPr>
-        <w:t>1</w:t>
-      </w:r>
-    </w:p>
-    <w:p>
-      <w:pPr>
-        <w:tabs>
-          <w:tab w:val="center" w:pos="4550"/>
-        </w:tabs>
-        <w:ind w:left="650" w:right="492" w:hanging="650"/>
-        <w:jc w:val="center"/>
         <w:rPr>
           <w:b/>
           <w:sz w:val="38"/>
           <w:szCs w:val="34"/>
         </w:rPr>
-      </w:pPr>
-      <w:r>
-        <w:rPr>
-          <w:b/>
-          <w:sz w:val="38"/>
-          <w:szCs w:val="34"/>
-        </w:rPr>
         <w:t>&lt;&lt;TÊN ĐỀ TÀI&gt;&gt;</w:t>
       </w:r>
-    </w:p>
-    <w:p>
-      <w:pPr>
-        <w:tabs>
-          <w:tab w:val="left" w:pos="1690"/>
-          <w:tab w:val="left" w:pos="4810"/>
-        </w:tabs>
-        <w:rPr>
-          <w:b/>
-          <w:sz w:val="30"/>
-        </w:rPr>
-      </w:pPr>
     </w:p>
     <w:tbl>
       <w:tblPr>
@@ -2854,857 +2738,13 @@
           <w:i/>
         </w:rPr>
       </w:pPr>
-    </w:p>
-    <w:p>
-      <w:pPr>
-        <w:tabs>
-          <w:tab w:val="left" w:pos="1694"/>
-          <w:tab w:val="left" w:pos="5544"/>
-        </w:tabs>
-        <w:ind w:right="-285"/>
+      <w:r>
         <w:rPr>
           <w:b/>
           <w:i/>
         </w:rPr>
-      </w:pPr>
-      <w:r>
-        <w:rPr>
-          <w:b/>
-          <w:i/>
-          <w:noProof/>
-        </w:rPr>
-        <mc:AlternateContent>
-          <mc:Choice Requires="wps">
-            <w:drawing>
-              <wp:anchor distT="0" distB="0" distL="114300" distR="114300" simplePos="0" relativeHeight="251663872" behindDoc="0" locked="0" layoutInCell="1" allowOverlap="1" wp14:anchorId="0C105B83" wp14:editId="52473A42">
-                <wp:simplePos x="0" y="0"/>
-                <wp:positionH relativeFrom="column">
-                  <wp:posOffset>5493385</wp:posOffset>
-                </wp:positionH>
-                <wp:positionV relativeFrom="paragraph">
-                  <wp:posOffset>92075</wp:posOffset>
-                </wp:positionV>
-                <wp:extent cx="88265" cy="179070"/>
-                <wp:effectExtent l="12065" t="27305" r="18415" b="27305"/>
-                <wp:wrapNone/>
-                <wp:docPr id="738020248" name="FreeForm 13"/>
-                <wp:cNvGraphicFramePr>
-                  <a:graphicFrameLocks xmlns:a="http://schemas.openxmlformats.org/drawingml/2006/main"/>
-                </wp:cNvGraphicFramePr>
-                <a:graphic xmlns:a="http://schemas.openxmlformats.org/drawingml/2006/main">
-                  <a:graphicData uri="http://schemas.microsoft.com/office/word/2010/wordprocessingShape">
-                    <wps:wsp>
-                      <wps:cNvSpPr>
-                        <a:spLocks/>
-                      </wps:cNvSpPr>
-                      <wps:spPr bwMode="auto">
-                        <a:xfrm rot="16200000">
-                          <a:off x="0" y="0"/>
-                          <a:ext cx="88265" cy="179070"/>
-                        </a:xfrm>
-                        <a:custGeom>
-                          <a:avLst/>
-                          <a:gdLst>
-                            <a:gd name="T0" fmla="*/ 8827 w 80"/>
-                            <a:gd name="T1" fmla="*/ 0 h 427"/>
-                            <a:gd name="T2" fmla="*/ 26480 w 80"/>
-                            <a:gd name="T3" fmla="*/ 0 h 427"/>
-                            <a:gd name="T4" fmla="*/ 61786 w 80"/>
-                            <a:gd name="T5" fmla="*/ 23065 h 427"/>
-                            <a:gd name="T6" fmla="*/ 79439 w 80"/>
-                            <a:gd name="T7" fmla="*/ 46550 h 427"/>
-                            <a:gd name="T8" fmla="*/ 88265 w 80"/>
-                            <a:gd name="T9" fmla="*/ 85551 h 427"/>
-                            <a:gd name="T10" fmla="*/ 79439 w 80"/>
-                            <a:gd name="T11" fmla="*/ 124552 h 427"/>
-                            <a:gd name="T12" fmla="*/ 44133 w 80"/>
-                            <a:gd name="T13" fmla="*/ 171102 h 427"/>
-                            <a:gd name="T14" fmla="*/ 26480 w 80"/>
-                            <a:gd name="T15" fmla="*/ 179070 h 427"/>
-                            <a:gd name="T16" fmla="*/ 17653 w 80"/>
-                            <a:gd name="T17" fmla="*/ 179070 h 427"/>
-                            <a:gd name="T18" fmla="*/ 17653 w 80"/>
-                            <a:gd name="T19" fmla="*/ 171102 h 427"/>
-                            <a:gd name="T20" fmla="*/ 26480 w 80"/>
-                            <a:gd name="T21" fmla="*/ 155585 h 427"/>
-                            <a:gd name="T22" fmla="*/ 35306 w 80"/>
-                            <a:gd name="T23" fmla="*/ 124552 h 427"/>
-                            <a:gd name="T24" fmla="*/ 35306 w 80"/>
-                            <a:gd name="T25" fmla="*/ 101068 h 427"/>
-                            <a:gd name="T26" fmla="*/ 17653 w 80"/>
-                            <a:gd name="T27" fmla="*/ 62066 h 427"/>
-                            <a:gd name="T28" fmla="*/ 0 w 80"/>
-                            <a:gd name="T29" fmla="*/ 31033 h 427"/>
-                            <a:gd name="T30" fmla="*/ 8827 w 80"/>
-                            <a:gd name="T31" fmla="*/ 0 h 427"/>
-                            <a:gd name="T32" fmla="*/ 0 60000 65536"/>
-                            <a:gd name="T33" fmla="*/ 0 60000 65536"/>
-                            <a:gd name="T34" fmla="*/ 0 60000 65536"/>
-                            <a:gd name="T35" fmla="*/ 0 60000 65536"/>
-                            <a:gd name="T36" fmla="*/ 0 60000 65536"/>
-                            <a:gd name="T37" fmla="*/ 0 60000 65536"/>
-                            <a:gd name="T38" fmla="*/ 0 60000 65536"/>
-                            <a:gd name="T39" fmla="*/ 0 60000 65536"/>
-                            <a:gd name="T40" fmla="*/ 0 60000 65536"/>
-                            <a:gd name="T41" fmla="*/ 0 60000 65536"/>
-                            <a:gd name="T42" fmla="*/ 0 60000 65536"/>
-                            <a:gd name="T43" fmla="*/ 0 60000 65536"/>
-                            <a:gd name="T44" fmla="*/ 0 60000 65536"/>
-                            <a:gd name="T45" fmla="*/ 0 60000 65536"/>
-                            <a:gd name="T46" fmla="*/ 0 60000 65536"/>
-                            <a:gd name="T47" fmla="*/ 0 60000 65536"/>
-                          </a:gdLst>
-                          <a:ahLst/>
-                          <a:cxnLst>
-                            <a:cxn ang="T32">
-                              <a:pos x="T0" y="T1"/>
-                            </a:cxn>
-                            <a:cxn ang="T33">
-                              <a:pos x="T2" y="T3"/>
-                            </a:cxn>
-                            <a:cxn ang="T34">
-                              <a:pos x="T4" y="T5"/>
-                            </a:cxn>
-                            <a:cxn ang="T35">
-                              <a:pos x="T6" y="T7"/>
-                            </a:cxn>
-                            <a:cxn ang="T36">
-                              <a:pos x="T8" y="T9"/>
-                            </a:cxn>
-                            <a:cxn ang="T37">
-                              <a:pos x="T10" y="T11"/>
-                            </a:cxn>
-                            <a:cxn ang="T38">
-                              <a:pos x="T12" y="T13"/>
-                            </a:cxn>
-                            <a:cxn ang="T39">
-                              <a:pos x="T14" y="T15"/>
-                            </a:cxn>
-                            <a:cxn ang="T40">
-                              <a:pos x="T16" y="T17"/>
-                            </a:cxn>
-                            <a:cxn ang="T41">
-                              <a:pos x="T18" y="T19"/>
-                            </a:cxn>
-                            <a:cxn ang="T42">
-                              <a:pos x="T20" y="T21"/>
-                            </a:cxn>
-                            <a:cxn ang="T43">
-                              <a:pos x="T22" y="T23"/>
-                            </a:cxn>
-                            <a:cxn ang="T44">
-                              <a:pos x="T24" y="T25"/>
-                            </a:cxn>
-                            <a:cxn ang="T45">
-                              <a:pos x="T26" y="T27"/>
-                            </a:cxn>
-                            <a:cxn ang="T46">
-                              <a:pos x="T28" y="T29"/>
-                            </a:cxn>
-                            <a:cxn ang="T47">
-                              <a:pos x="T30" y="T31"/>
-                            </a:cxn>
-                          </a:cxnLst>
-                          <a:rect l="0" t="0" r="r" b="b"/>
-                          <a:pathLst>
-                            <a:path w="80" h="427">
-                              <a:moveTo>
-                                <a:pt x="8" y="0"/>
-                              </a:moveTo>
-                              <a:lnTo>
-                                <a:pt x="24" y="0"/>
-                              </a:lnTo>
-                              <a:lnTo>
-                                <a:pt x="56" y="55"/>
-                              </a:lnTo>
-                              <a:lnTo>
-                                <a:pt x="72" y="111"/>
-                              </a:lnTo>
-                              <a:lnTo>
-                                <a:pt x="80" y="204"/>
-                              </a:lnTo>
-                              <a:lnTo>
-                                <a:pt x="72" y="297"/>
-                              </a:lnTo>
-                              <a:lnTo>
-                                <a:pt x="40" y="408"/>
-                              </a:lnTo>
-                              <a:lnTo>
-                                <a:pt x="24" y="427"/>
-                              </a:lnTo>
-                              <a:lnTo>
-                                <a:pt x="16" y="427"/>
-                              </a:lnTo>
-                              <a:lnTo>
-                                <a:pt x="16" y="408"/>
-                              </a:lnTo>
-                              <a:lnTo>
-                                <a:pt x="24" y="371"/>
-                              </a:lnTo>
-                              <a:lnTo>
-                                <a:pt x="32" y="297"/>
-                              </a:lnTo>
-                              <a:lnTo>
-                                <a:pt x="32" y="241"/>
-                              </a:lnTo>
-                              <a:lnTo>
-                                <a:pt x="16" y="148"/>
-                              </a:lnTo>
-                              <a:lnTo>
-                                <a:pt x="0" y="74"/>
-                              </a:lnTo>
-                              <a:lnTo>
-                                <a:pt x="8" y="0"/>
-                              </a:lnTo>
-                              <a:close/>
-                            </a:path>
-                          </a:pathLst>
-                        </a:custGeom>
-                        <a:solidFill>
-                          <a:srgbClr val="FFFFFF"/>
-                        </a:solidFill>
-                        <a:ln w="19050" cmpd="sng">
-                          <a:solidFill>
-                            <a:srgbClr val="FFFFFF"/>
-                          </a:solidFill>
-                          <a:prstDash val="solid"/>
-                          <a:round/>
-                          <a:headEnd/>
-                          <a:tailEnd/>
-                        </a:ln>
-                      </wps:spPr>
-                      <wps:bodyPr rot="0" vert="horz" wrap="square" lIns="91440" tIns="45720" rIns="91440" bIns="45720" anchor="t" anchorCtr="0" upright="1">
-                        <a:noAutofit/>
-                      </wps:bodyPr>
-                    </wps:wsp>
-                  </a:graphicData>
-                </a:graphic>
-                <wp14:sizeRelH relativeFrom="page">
-                  <wp14:pctWidth>0</wp14:pctWidth>
-                </wp14:sizeRelH>
-                <wp14:sizeRelV relativeFrom="page">
-                  <wp14:pctHeight>0</wp14:pctHeight>
-                </wp14:sizeRelV>
-              </wp:anchor>
-            </w:drawing>
-          </mc:Choice>
-          <mc:Fallback>
-            <w:pict>
-              <v:shape w14:anchorId="1FCF3E9A" id="FreeForm 13" o:spid="_x0000_s1026" style="position:absolute;margin-left:432.55pt;margin-top:7.25pt;width:6.95pt;height:14.1pt;rotation:-90;z-index:251663872;visibility:visible;mso-wrap-style:square;mso-width-percent:0;mso-height-percent:0;mso-wrap-distance-left:9pt;mso-wrap-distance-top:0;mso-wrap-distance-right:9pt;mso-wrap-distance-bottom:0;mso-position-horizontal:absolute;mso-position-horizontal-relative:text;mso-position-vertical:absolute;mso-position-vertical-relative:text;mso-width-percent:0;mso-height-percent:0;mso-width-relative:page;mso-height-relative:page;v-text-anchor:top" coordsize="80,427" o:gfxdata="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" path="m8,l24,,56,55r16,56l80,204r-8,93l40,408,24,427r-8,l16,408r8,-37l32,297r,-56l16,148,,74,8,xe" strokecolor="white" strokeweight="1.5pt">
-                <v:path arrowok="t" o:connecttype="custom" o:connectlocs="9738939,0;29215715,0;68169266,9672716;87646042,19521566;97383878,35877325;87646042,52233083;48692491,71754649;29215715,75096171;19476776,75096171;19476776,71754649;29215715,65247321;38953551,52233083;38953551,42384653;19476776,26028475;0,13014237;9738939,0" o:connectangles="0,0,0,0,0,0,0,0,0,0,0,0,0,0,0,0"/>
-              </v:shape>
-            </w:pict>
-          </mc:Fallback>
-        </mc:AlternateContent>
-      </w:r>
-      <w:r>
-        <w:rPr>
-          <w:b/>
-          <w:i/>
-          <w:noProof/>
-        </w:rPr>
-        <mc:AlternateContent>
-          <mc:Choice Requires="wps">
-            <w:drawing>
-              <wp:anchor distT="0" distB="0" distL="114300" distR="114300" simplePos="0" relativeHeight="251656704" behindDoc="0" locked="0" layoutInCell="1" allowOverlap="1" wp14:anchorId="6A935F31" wp14:editId="1192E733">
-                <wp:simplePos x="0" y="0"/>
-                <wp:positionH relativeFrom="column">
-                  <wp:posOffset>5026660</wp:posOffset>
-                </wp:positionH>
-                <wp:positionV relativeFrom="paragraph">
-                  <wp:posOffset>163195</wp:posOffset>
-                </wp:positionV>
-                <wp:extent cx="296545" cy="264160"/>
-                <wp:effectExtent l="16510" t="17780" r="14605" b="28575"/>
-                <wp:wrapNone/>
-                <wp:docPr id="890871373" name="FreeForm 12"/>
-                <wp:cNvGraphicFramePr>
-                  <a:graphicFrameLocks xmlns:a="http://schemas.openxmlformats.org/drawingml/2006/main"/>
-                </wp:cNvGraphicFramePr>
-                <a:graphic xmlns:a="http://schemas.openxmlformats.org/drawingml/2006/main">
-                  <a:graphicData uri="http://schemas.microsoft.com/office/word/2010/wordprocessingShape">
-                    <wps:wsp>
-                      <wps:cNvSpPr>
-                        <a:spLocks/>
-                      </wps:cNvSpPr>
-                      <wps:spPr bwMode="auto">
-                        <a:xfrm rot="16200000">
-                          <a:off x="0" y="0"/>
-                          <a:ext cx="296545" cy="264160"/>
-                        </a:xfrm>
-                        <a:custGeom>
-                          <a:avLst/>
-                          <a:gdLst>
-                            <a:gd name="T0" fmla="*/ 131311 w 271"/>
-                            <a:gd name="T1" fmla="*/ 23444 h 631"/>
-                            <a:gd name="T2" fmla="*/ 87541 w 271"/>
-                            <a:gd name="T3" fmla="*/ 15490 h 631"/>
-                            <a:gd name="T4" fmla="*/ 52525 w 271"/>
-                            <a:gd name="T5" fmla="*/ 15490 h 631"/>
-                            <a:gd name="T6" fmla="*/ 52525 w 271"/>
-                            <a:gd name="T7" fmla="*/ 38933 h 631"/>
-                            <a:gd name="T8" fmla="*/ 70033 w 271"/>
-                            <a:gd name="T9" fmla="*/ 85402 h 631"/>
-                            <a:gd name="T10" fmla="*/ 61279 w 271"/>
-                            <a:gd name="T11" fmla="*/ 155314 h 631"/>
-                            <a:gd name="T12" fmla="*/ 43770 w 271"/>
-                            <a:gd name="T13" fmla="*/ 202202 h 631"/>
-                            <a:gd name="T14" fmla="*/ 8754 w 271"/>
-                            <a:gd name="T15" fmla="*/ 248670 h 631"/>
-                            <a:gd name="T16" fmla="*/ 0 w 271"/>
-                            <a:gd name="T17" fmla="*/ 264160 h 631"/>
-                            <a:gd name="T18" fmla="*/ 8754 w 271"/>
-                            <a:gd name="T19" fmla="*/ 264160 h 631"/>
-                            <a:gd name="T20" fmla="*/ 26262 w 271"/>
-                            <a:gd name="T21" fmla="*/ 248670 h 631"/>
-                            <a:gd name="T22" fmla="*/ 61279 w 271"/>
-                            <a:gd name="T23" fmla="*/ 217691 h 631"/>
-                            <a:gd name="T24" fmla="*/ 157574 w 271"/>
-                            <a:gd name="T25" fmla="*/ 139825 h 631"/>
-                            <a:gd name="T26" fmla="*/ 252775 w 271"/>
-                            <a:gd name="T27" fmla="*/ 54423 h 631"/>
-                            <a:gd name="T28" fmla="*/ 279037 w 271"/>
-                            <a:gd name="T29" fmla="*/ 23444 h 631"/>
-                            <a:gd name="T30" fmla="*/ 296545 w 271"/>
-                            <a:gd name="T31" fmla="*/ 7535 h 631"/>
-                            <a:gd name="T32" fmla="*/ 296545 w 271"/>
-                            <a:gd name="T33" fmla="*/ 0 h 631"/>
-                            <a:gd name="T34" fmla="*/ 287791 w 271"/>
-                            <a:gd name="T35" fmla="*/ 0 h 631"/>
-                            <a:gd name="T36" fmla="*/ 244020 w 271"/>
-                            <a:gd name="T37" fmla="*/ 7535 h 631"/>
-                            <a:gd name="T38" fmla="*/ 200250 w 271"/>
-                            <a:gd name="T39" fmla="*/ 15490 h 631"/>
-                            <a:gd name="T40" fmla="*/ 157574 w 271"/>
-                            <a:gd name="T41" fmla="*/ 30979 h 631"/>
-                            <a:gd name="T42" fmla="*/ 148820 w 271"/>
-                            <a:gd name="T43" fmla="*/ 30979 h 631"/>
-                            <a:gd name="T44" fmla="*/ 131311 w 271"/>
-                            <a:gd name="T45" fmla="*/ 23444 h 631"/>
-                            <a:gd name="T46" fmla="*/ 0 60000 65536"/>
-                            <a:gd name="T47" fmla="*/ 0 60000 65536"/>
-                            <a:gd name="T48" fmla="*/ 0 60000 65536"/>
-                            <a:gd name="T49" fmla="*/ 0 60000 65536"/>
-                            <a:gd name="T50" fmla="*/ 0 60000 65536"/>
-                            <a:gd name="T51" fmla="*/ 0 60000 65536"/>
-                            <a:gd name="T52" fmla="*/ 0 60000 65536"/>
-                            <a:gd name="T53" fmla="*/ 0 60000 65536"/>
-                            <a:gd name="T54" fmla="*/ 0 60000 65536"/>
-                            <a:gd name="T55" fmla="*/ 0 60000 65536"/>
-                            <a:gd name="T56" fmla="*/ 0 60000 65536"/>
-                            <a:gd name="T57" fmla="*/ 0 60000 65536"/>
-                            <a:gd name="T58" fmla="*/ 0 60000 65536"/>
-                            <a:gd name="T59" fmla="*/ 0 60000 65536"/>
-                            <a:gd name="T60" fmla="*/ 0 60000 65536"/>
-                            <a:gd name="T61" fmla="*/ 0 60000 65536"/>
-                            <a:gd name="T62" fmla="*/ 0 60000 65536"/>
-                            <a:gd name="T63" fmla="*/ 0 60000 65536"/>
-                            <a:gd name="T64" fmla="*/ 0 60000 65536"/>
-                            <a:gd name="T65" fmla="*/ 0 60000 65536"/>
-                            <a:gd name="T66" fmla="*/ 0 60000 65536"/>
-                            <a:gd name="T67" fmla="*/ 0 60000 65536"/>
-                            <a:gd name="T68" fmla="*/ 0 60000 65536"/>
-                          </a:gdLst>
-                          <a:ahLst/>
-                          <a:cxnLst>
-                            <a:cxn ang="T46">
-                              <a:pos x="T0" y="T1"/>
-                            </a:cxn>
-                            <a:cxn ang="T47">
-                              <a:pos x="T2" y="T3"/>
-                            </a:cxn>
-                            <a:cxn ang="T48">
-                              <a:pos x="T4" y="T5"/>
-                            </a:cxn>
-                            <a:cxn ang="T49">
-                              <a:pos x="T6" y="T7"/>
-                            </a:cxn>
-                            <a:cxn ang="T50">
-                              <a:pos x="T8" y="T9"/>
-                            </a:cxn>
-                            <a:cxn ang="T51">
-                              <a:pos x="T10" y="T11"/>
-                            </a:cxn>
-                            <a:cxn ang="T52">
-                              <a:pos x="T12" y="T13"/>
-                            </a:cxn>
-                            <a:cxn ang="T53">
-                              <a:pos x="T14" y="T15"/>
-                            </a:cxn>
-                            <a:cxn ang="T54">
-                              <a:pos x="T16" y="T17"/>
-                            </a:cxn>
-                            <a:cxn ang="T55">
-                              <a:pos x="T18" y="T19"/>
-                            </a:cxn>
-                            <a:cxn ang="T56">
-                              <a:pos x="T20" y="T21"/>
-                            </a:cxn>
-                            <a:cxn ang="T57">
-                              <a:pos x="T22" y="T23"/>
-                            </a:cxn>
-                            <a:cxn ang="T58">
-                              <a:pos x="T24" y="T25"/>
-                            </a:cxn>
-                            <a:cxn ang="T59">
-                              <a:pos x="T26" y="T27"/>
-                            </a:cxn>
-                            <a:cxn ang="T60">
-                              <a:pos x="T28" y="T29"/>
-                            </a:cxn>
-                            <a:cxn ang="T61">
-                              <a:pos x="T30" y="T31"/>
-                            </a:cxn>
-                            <a:cxn ang="T62">
-                              <a:pos x="T32" y="T33"/>
-                            </a:cxn>
-                            <a:cxn ang="T63">
-                              <a:pos x="T34" y="T35"/>
-                            </a:cxn>
-                            <a:cxn ang="T64">
-                              <a:pos x="T36" y="T37"/>
-                            </a:cxn>
-                            <a:cxn ang="T65">
-                              <a:pos x="T38" y="T39"/>
-                            </a:cxn>
-                            <a:cxn ang="T66">
-                              <a:pos x="T40" y="T41"/>
-                            </a:cxn>
-                            <a:cxn ang="T67">
-                              <a:pos x="T42" y="T43"/>
-                            </a:cxn>
-                            <a:cxn ang="T68">
-                              <a:pos x="T44" y="T45"/>
-                            </a:cxn>
-                          </a:cxnLst>
-                          <a:rect l="0" t="0" r="r" b="b"/>
-                          <a:pathLst>
-                            <a:path w="271" h="631">
-                              <a:moveTo>
-                                <a:pt x="120" y="56"/>
-                              </a:moveTo>
-                              <a:lnTo>
-                                <a:pt x="80" y="37"/>
-                              </a:lnTo>
-                              <a:lnTo>
-                                <a:pt x="48" y="37"/>
-                              </a:lnTo>
-                              <a:lnTo>
-                                <a:pt x="48" y="93"/>
-                              </a:lnTo>
-                              <a:lnTo>
-                                <a:pt x="64" y="204"/>
-                              </a:lnTo>
-                              <a:lnTo>
-                                <a:pt x="56" y="371"/>
-                              </a:lnTo>
-                              <a:lnTo>
-                                <a:pt x="40" y="483"/>
-                              </a:lnTo>
-                              <a:lnTo>
-                                <a:pt x="8" y="594"/>
-                              </a:lnTo>
-                              <a:lnTo>
-                                <a:pt x="0" y="631"/>
-                              </a:lnTo>
-                              <a:lnTo>
-                                <a:pt x="8" y="631"/>
-                              </a:lnTo>
-                              <a:lnTo>
-                                <a:pt x="24" y="594"/>
-                              </a:lnTo>
-                              <a:lnTo>
-                                <a:pt x="56" y="520"/>
-                              </a:lnTo>
-                              <a:lnTo>
-                                <a:pt x="144" y="334"/>
-                              </a:lnTo>
-                              <a:lnTo>
-                                <a:pt x="231" y="130"/>
-                              </a:lnTo>
-                              <a:lnTo>
-                                <a:pt x="255" y="56"/>
-                              </a:lnTo>
-                              <a:lnTo>
-                                <a:pt x="271" y="18"/>
-                              </a:lnTo>
-                              <a:lnTo>
-                                <a:pt x="271" y="0"/>
-                              </a:lnTo>
-                              <a:lnTo>
-                                <a:pt x="263" y="0"/>
-                              </a:lnTo>
-                              <a:lnTo>
-                                <a:pt x="223" y="18"/>
-                              </a:lnTo>
-                              <a:lnTo>
-                                <a:pt x="183" y="37"/>
-                              </a:lnTo>
-                              <a:lnTo>
-                                <a:pt x="144" y="74"/>
-                              </a:lnTo>
-                              <a:lnTo>
-                                <a:pt x="136" y="74"/>
-                              </a:lnTo>
-                              <a:lnTo>
-                                <a:pt x="120" y="56"/>
-                              </a:lnTo>
-                              <a:close/>
-                            </a:path>
-                          </a:pathLst>
-                        </a:custGeom>
-                        <a:solidFill>
-                          <a:srgbClr val="FFFFFF"/>
-                        </a:solidFill>
-                        <a:ln w="19050" cmpd="sng">
-                          <a:solidFill>
-                            <a:srgbClr val="FFFFFF"/>
-                          </a:solidFill>
-                          <a:prstDash val="solid"/>
-                          <a:round/>
-                          <a:headEnd/>
-                          <a:tailEnd/>
-                        </a:ln>
-                      </wps:spPr>
-                      <wps:bodyPr rot="0" vert="horz" wrap="square" lIns="91440" tIns="45720" rIns="91440" bIns="45720" anchor="t" anchorCtr="0" upright="1">
-                        <a:noAutofit/>
-                      </wps:bodyPr>
-                    </wps:wsp>
-                  </a:graphicData>
-                </a:graphic>
-                <wp14:sizeRelH relativeFrom="page">
-                  <wp14:pctWidth>0</wp14:pctWidth>
-                </wp14:sizeRelH>
-                <wp14:sizeRelV relativeFrom="page">
-                  <wp14:pctHeight>0</wp14:pctHeight>
-                </wp14:sizeRelV>
-              </wp:anchor>
-            </w:drawing>
-          </mc:Choice>
-          <mc:Fallback>
-            <w:pict>
-              <v:shape w14:anchorId="701594E3" id="FreeForm 12" o:spid="_x0000_s1026" style="position:absolute;margin-left:395.8pt;margin-top:12.85pt;width:23.35pt;height:20.8pt;rotation:-90;z-index:251656704;visibility:visible;mso-wrap-style:square;mso-width-percent:0;mso-height-percent:0;mso-wrap-distance-left:9pt;mso-wrap-distance-top:0;mso-wrap-distance-right:9pt;mso-wrap-distance-bottom:0;mso-position-horizontal:absolute;mso-position-horizontal-relative:text;mso-position-vertical:absolute;mso-position-vertical-relative:text;mso-width-percent:0;mso-height-percent:0;mso-width-relative:page;mso-height-relative:page;v-text-anchor:top" coordsize="271,631" o:gfxdata="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" path="m120,56l80,37r-32,l48,93,64,204,56,371,40,483,8,594,,631r8,l24,594,56,520,144,334,231,130,255,56,271,18,271,r-8,l223,18,183,37,144,74r-8,l120,56xe" strokecolor="white" strokeweight="1.5pt">
-                <v:path arrowok="t" o:connecttype="custom" o:connectlocs="143688637,9814528;95792789,6484688;57476111,6484688;57476111,16298798;76634450,35752444;67055281,65020200;47895847,84649256;9579169,104102484;0,110587172;9579169,110587172;28737508,104102484;67055281,91133525;172427239,58535930;276602075,22783486;305339584,9814528;324497923,3154430;324497923,0;314918753,0;267021811,3154430;219125964,6484688;172427239,12968958;162848070,12968958;143688637,9814528" o:connectangles="0,0,0,0,0,0,0,0,0,0,0,0,0,0,0,0,0,0,0,0,0,0,0"/>
-              </v:shape>
-            </w:pict>
-          </mc:Fallback>
-        </mc:AlternateContent>
-      </w:r>
-      <w:r>
-        <w:rPr>
-          <w:b/>
-          <w:i/>
-          <w:noProof/>
-        </w:rPr>
-        <mc:AlternateContent>
-          <mc:Choice Requires="wps">
-            <w:drawing>
-              <wp:anchor distT="0" distB="0" distL="114300" distR="114300" simplePos="0" relativeHeight="251651584" behindDoc="0" locked="0" layoutInCell="1" allowOverlap="1" wp14:anchorId="32B7DA41" wp14:editId="0A1BFC47">
-                <wp:simplePos x="0" y="0"/>
-                <wp:positionH relativeFrom="column">
-                  <wp:posOffset>277495</wp:posOffset>
-                </wp:positionH>
-                <wp:positionV relativeFrom="paragraph">
-                  <wp:posOffset>92075</wp:posOffset>
-                </wp:positionV>
-                <wp:extent cx="88265" cy="179070"/>
-                <wp:effectExtent l="15875" t="27305" r="14605" b="27305"/>
-                <wp:wrapNone/>
-                <wp:docPr id="1739278478" name="FreeForm 11"/>
-                <wp:cNvGraphicFramePr>
-                  <a:graphicFrameLocks xmlns:a="http://schemas.openxmlformats.org/drawingml/2006/main"/>
-                </wp:cNvGraphicFramePr>
-                <a:graphic xmlns:a="http://schemas.openxmlformats.org/drawingml/2006/main">
-                  <a:graphicData uri="http://schemas.microsoft.com/office/word/2010/wordprocessingShape">
-                    <wps:wsp>
-                      <wps:cNvSpPr>
-                        <a:spLocks/>
-                      </wps:cNvSpPr>
-                      <wps:spPr bwMode="auto">
-                        <a:xfrm rot="16200000">
-                          <a:off x="0" y="0"/>
-                          <a:ext cx="88265" cy="179070"/>
-                        </a:xfrm>
-                        <a:custGeom>
-                          <a:avLst/>
-                          <a:gdLst>
-                            <a:gd name="T0" fmla="*/ 8827 w 80"/>
-                            <a:gd name="T1" fmla="*/ 179070 h 427"/>
-                            <a:gd name="T2" fmla="*/ 26480 w 80"/>
-                            <a:gd name="T3" fmla="*/ 179070 h 427"/>
-                            <a:gd name="T4" fmla="*/ 61786 w 80"/>
-                            <a:gd name="T5" fmla="*/ 163553 h 427"/>
-                            <a:gd name="T6" fmla="*/ 79439 w 80"/>
-                            <a:gd name="T7" fmla="*/ 132101 h 427"/>
-                            <a:gd name="T8" fmla="*/ 88265 w 80"/>
-                            <a:gd name="T9" fmla="*/ 101068 h 427"/>
-                            <a:gd name="T10" fmla="*/ 79439 w 80"/>
-                            <a:gd name="T11" fmla="*/ 62066 h 427"/>
-                            <a:gd name="T12" fmla="*/ 44133 w 80"/>
-                            <a:gd name="T13" fmla="*/ 15517 h 427"/>
-                            <a:gd name="T14" fmla="*/ 26480 w 80"/>
-                            <a:gd name="T15" fmla="*/ 0 h 427"/>
-                            <a:gd name="T16" fmla="*/ 17653 w 80"/>
-                            <a:gd name="T17" fmla="*/ 0 h 427"/>
-                            <a:gd name="T18" fmla="*/ 17653 w 80"/>
-                            <a:gd name="T19" fmla="*/ 7549 h 427"/>
-                            <a:gd name="T20" fmla="*/ 26480 w 80"/>
-                            <a:gd name="T21" fmla="*/ 31033 h 427"/>
-                            <a:gd name="T22" fmla="*/ 35306 w 80"/>
-                            <a:gd name="T23" fmla="*/ 54518 h 427"/>
-                            <a:gd name="T24" fmla="*/ 35306 w 80"/>
-                            <a:gd name="T25" fmla="*/ 77583 h 427"/>
-                            <a:gd name="T26" fmla="*/ 17653 w 80"/>
-                            <a:gd name="T27" fmla="*/ 124552 h 427"/>
-                            <a:gd name="T28" fmla="*/ 0 w 80"/>
-                            <a:gd name="T29" fmla="*/ 155585 h 427"/>
-                            <a:gd name="T30" fmla="*/ 8827 w 80"/>
-                            <a:gd name="T31" fmla="*/ 179070 h 427"/>
-                            <a:gd name="T32" fmla="*/ 0 60000 65536"/>
-                            <a:gd name="T33" fmla="*/ 0 60000 65536"/>
-                            <a:gd name="T34" fmla="*/ 0 60000 65536"/>
-                            <a:gd name="T35" fmla="*/ 0 60000 65536"/>
-                            <a:gd name="T36" fmla="*/ 0 60000 65536"/>
-                            <a:gd name="T37" fmla="*/ 0 60000 65536"/>
-                            <a:gd name="T38" fmla="*/ 0 60000 65536"/>
-                            <a:gd name="T39" fmla="*/ 0 60000 65536"/>
-                            <a:gd name="T40" fmla="*/ 0 60000 65536"/>
-                            <a:gd name="T41" fmla="*/ 0 60000 65536"/>
-                            <a:gd name="T42" fmla="*/ 0 60000 65536"/>
-                            <a:gd name="T43" fmla="*/ 0 60000 65536"/>
-                            <a:gd name="T44" fmla="*/ 0 60000 65536"/>
-                            <a:gd name="T45" fmla="*/ 0 60000 65536"/>
-                            <a:gd name="T46" fmla="*/ 0 60000 65536"/>
-                            <a:gd name="T47" fmla="*/ 0 60000 65536"/>
-                          </a:gdLst>
-                          <a:ahLst/>
-                          <a:cxnLst>
-                            <a:cxn ang="T32">
-                              <a:pos x="T0" y="T1"/>
-                            </a:cxn>
-                            <a:cxn ang="T33">
-                              <a:pos x="T2" y="T3"/>
-                            </a:cxn>
-                            <a:cxn ang="T34">
-                              <a:pos x="T4" y="T5"/>
-                            </a:cxn>
-                            <a:cxn ang="T35">
-                              <a:pos x="T6" y="T7"/>
-                            </a:cxn>
-                            <a:cxn ang="T36">
-                              <a:pos x="T8" y="T9"/>
-                            </a:cxn>
-                            <a:cxn ang="T37">
-                              <a:pos x="T10" y="T11"/>
-                            </a:cxn>
-                            <a:cxn ang="T38">
-                              <a:pos x="T12" y="T13"/>
-                            </a:cxn>
-                            <a:cxn ang="T39">
-                              <a:pos x="T14" y="T15"/>
-                            </a:cxn>
-                            <a:cxn ang="T40">
-                              <a:pos x="T16" y="T17"/>
-                            </a:cxn>
-                            <a:cxn ang="T41">
-                              <a:pos x="T18" y="T19"/>
-                            </a:cxn>
-                            <a:cxn ang="T42">
-                              <a:pos x="T20" y="T21"/>
-                            </a:cxn>
-                            <a:cxn ang="T43">
-                              <a:pos x="T22" y="T23"/>
-                            </a:cxn>
-                            <a:cxn ang="T44">
-                              <a:pos x="T24" y="T25"/>
-                            </a:cxn>
-                            <a:cxn ang="T45">
-                              <a:pos x="T26" y="T27"/>
-                            </a:cxn>
-                            <a:cxn ang="T46">
-                              <a:pos x="T28" y="T29"/>
-                            </a:cxn>
-                            <a:cxn ang="T47">
-                              <a:pos x="T30" y="T31"/>
-                            </a:cxn>
-                          </a:cxnLst>
-                          <a:rect l="0" t="0" r="r" b="b"/>
-                          <a:pathLst>
-                            <a:path w="80" h="427">
-                              <a:moveTo>
-                                <a:pt x="8" y="427"/>
-                              </a:moveTo>
-                              <a:lnTo>
-                                <a:pt x="24" y="427"/>
-                              </a:lnTo>
-                              <a:lnTo>
-                                <a:pt x="56" y="390"/>
-                              </a:lnTo>
-                              <a:lnTo>
-                                <a:pt x="72" y="315"/>
-                              </a:lnTo>
-                              <a:lnTo>
-                                <a:pt x="80" y="241"/>
-                              </a:lnTo>
-                              <a:lnTo>
-                                <a:pt x="72" y="148"/>
-                              </a:lnTo>
-                              <a:lnTo>
-                                <a:pt x="40" y="37"/>
-                              </a:lnTo>
-                              <a:lnTo>
-                                <a:pt x="24" y="0"/>
-                              </a:lnTo>
-                              <a:lnTo>
-                                <a:pt x="16" y="0"/>
-                              </a:lnTo>
-                              <a:lnTo>
-                                <a:pt x="16" y="18"/>
-                              </a:lnTo>
-                              <a:lnTo>
-                                <a:pt x="24" y="74"/>
-                              </a:lnTo>
-                              <a:lnTo>
-                                <a:pt x="32" y="130"/>
-                              </a:lnTo>
-                              <a:lnTo>
-                                <a:pt x="32" y="185"/>
-                              </a:lnTo>
-                              <a:lnTo>
-                                <a:pt x="16" y="297"/>
-                              </a:lnTo>
-                              <a:lnTo>
-                                <a:pt x="0" y="371"/>
-                              </a:lnTo>
-                              <a:lnTo>
-                                <a:pt x="8" y="427"/>
-                              </a:lnTo>
-                              <a:close/>
-                            </a:path>
-                          </a:pathLst>
-                        </a:custGeom>
-                        <a:solidFill>
-                          <a:srgbClr val="FFFFFF"/>
-                        </a:solidFill>
-                        <a:ln w="19050" cmpd="sng">
-                          <a:solidFill>
-                            <a:srgbClr val="FFFFFF"/>
-                          </a:solidFill>
-                          <a:prstDash val="solid"/>
-                          <a:round/>
-                          <a:headEnd/>
-                          <a:tailEnd/>
-                        </a:ln>
-                      </wps:spPr>
-                      <wps:bodyPr rot="0" vert="horz" wrap="square" lIns="91440" tIns="45720" rIns="91440" bIns="45720" anchor="t" anchorCtr="0" upright="1">
-                        <a:noAutofit/>
-                      </wps:bodyPr>
-                    </wps:wsp>
-                  </a:graphicData>
-                </a:graphic>
-                <wp14:sizeRelH relativeFrom="page">
-                  <wp14:pctWidth>0</wp14:pctWidth>
-                </wp14:sizeRelH>
-                <wp14:sizeRelV relativeFrom="page">
-                  <wp14:pctHeight>0</wp14:pctHeight>
-                </wp14:sizeRelV>
-              </wp:anchor>
-            </w:drawing>
-          </mc:Choice>
-          <mc:Fallback>
-            <w:pict>
-              <v:shape w14:anchorId="405E6262" id="FreeForm 11" o:spid="_x0000_s1026" style="position:absolute;margin-left:21.85pt;margin-top:7.25pt;width:6.95pt;height:14.1pt;rotation:-90;z-index:251651584;visibility:visible;mso-wrap-style:square;mso-width-percent:0;mso-height-percent:0;mso-wrap-distance-left:9pt;mso-wrap-distance-top:0;mso-wrap-distance-right:9pt;mso-wrap-distance-bottom:0;mso-position-horizontal:absolute;mso-position-horizontal-relative:text;mso-position-vertical:absolute;mso-position-vertical-relative:text;mso-width-percent:0;mso-height-percent:0;mso-width-relative:page;mso-height-relative:page;v-text-anchor:top" coordsize="80,427" o:gfxdata="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" path="m8,427r16,l56,390,72,315r8,-74l72,148,40,37,24,,16,r,18l24,74r8,56l32,185,16,297,,371r8,56xe" strokecolor="white" strokeweight="1.5pt">
-                <v:path arrowok="t" o:connecttype="custom" o:connectlocs="9738939,75096171;29215715,75096171;68169266,68588842;87646042,55398890;97383878,42384653;87646042,26028475;48692491,6507328;29215715,0;19476776,0;19476776,3165807;29215715,13014237;38953551,22863087;38953551,32535803;19476776,52233083;0,65247321;9738939,75096171" o:connectangles="0,0,0,0,0,0,0,0,0,0,0,0,0,0,0,0"/>
-              </v:shape>
-            </w:pict>
-          </mc:Fallback>
-        </mc:AlternateContent>
-      </w:r>
-    </w:p>
-    <w:p>
-      <w:pPr>
-        <w:tabs>
-          <w:tab w:val="left" w:pos="1694"/>
-          <w:tab w:val="left" w:pos="5544"/>
-        </w:tabs>
-        <w:ind w:right="-285"/>
-        <w:rPr>
-          <w:b/>
-          <w:i/>
-        </w:rPr>
-      </w:pPr>
-    </w:p>
-    <w:p>
-      <w:pPr>
-        <w:tabs>
-          <w:tab w:val="left" w:pos="1694"/>
-          <w:tab w:val="left" w:pos="5544"/>
-        </w:tabs>
-        <w:ind w:right="-285"/>
-        <w:rPr>
-          <w:b/>
-          <w:i/>
-        </w:rPr>
-      </w:pPr>
-      <w:r>
-        <w:rPr>
-          <w:b/>
-          <w:i/>
-        </w:rPr>
         <w:t>'</w:t>
       </w:r>
-    </w:p>
-    <w:p>
-      <w:pPr>
-        <w:tabs>
-          <w:tab w:val="left" w:pos="1694"/>
-          <w:tab w:val="left" w:pos="5544"/>
-        </w:tabs>
-        <w:ind w:right="-285"/>
-        <w:rPr>
-          <w:b/>
-          <w:i/>
-        </w:rPr>
-      </w:pPr>
-    </w:p>
-    <w:p>
-      <w:pPr>
-        <w:tabs>
-          <w:tab w:val="left" w:pos="1694"/>
-          <w:tab w:val="left" w:pos="5544"/>
-        </w:tabs>
-        <w:ind w:right="-285"/>
-        <w:rPr>
-          <w:b/>
-          <w:i/>
-        </w:rPr>
-      </w:pPr>
-    </w:p>
-    <w:p>
-      <w:pPr>
-        <w:tabs>
-          <w:tab w:val="left" w:pos="1694"/>
-          <w:tab w:val="left" w:pos="5544"/>
-        </w:tabs>
-        <w:ind w:right="-285"/>
-        <w:rPr>
-          <w:b/>
-          <w:i/>
-        </w:rPr>
-      </w:pPr>
-    </w:p>
-    <w:p>
-      <w:pPr>
-        <w:tabs>
-          <w:tab w:val="left" w:pos="1694"/>
-          <w:tab w:val="left" w:pos="5544"/>
-        </w:tabs>
-        <w:ind w:right="-285"/>
-        <w:rPr>
-          <w:b/>
-          <w:i/>
-        </w:rPr>
-      </w:pPr>
     </w:p>
     <w:p>
       <w:pPr>
@@ -5612,83 +4652,12 @@
     </w:p>
     <w:p>
       <w:pPr>
-        <w:tabs>
-          <w:tab w:val="left" w:pos="1694"/>
-          <w:tab w:val="left" w:pos="5544"/>
-        </w:tabs>
-        <w:ind w:right="-285"/>
-        <w:jc w:val="left"/>
-        <w:rPr>
-          <w:b/>
-          <w:szCs w:val="28"/>
-        </w:rPr>
-      </w:pPr>
-    </w:p>
-    <w:p>
-      <w:pPr>
-        <w:tabs>
-          <w:tab w:val="left" w:pos="1694"/>
-          <w:tab w:val="left" w:pos="5544"/>
-        </w:tabs>
-        <w:ind w:right="-285"/>
-        <w:jc w:val="left"/>
-        <w:rPr>
-          <w:b/>
-          <w:szCs w:val="28"/>
-        </w:rPr>
-      </w:pPr>
-    </w:p>
-    <w:p>
-      <w:pPr>
-        <w:spacing w:line="240" w:lineRule="auto"/>
-        <w:jc w:val="left"/>
-        <w:rPr>
-          <w:b/>
-          <w:color w:val="EE0000"/>
-          <w:sz w:val="32"/>
-        </w:rPr>
-      </w:pPr>
-      <w:r>
-        <w:br w:type="page"/>
-      </w:r>
-    </w:p>
-    <w:p>
-      <w:pPr>
         <w:pStyle w:val="Heading1"/>
         <w:jc w:val="center"/>
       </w:pPr>
       <w:r>
         <w:lastRenderedPageBreak/>
         <w:t>LỜI MỞ ĐẦU</w:t>
-      </w:r>
-    </w:p>
-    <w:p>
-      <w:pPr>
-        <w:ind w:right="-16"/>
-        <w:rPr>
-          <w:bCs/>
-          <w:sz w:val="36"/>
-          <w:szCs w:val="36"/>
-        </w:rPr>
-      </w:pPr>
-    </w:p>
-    <w:p>
-      <w:pPr>
-        <w:spacing w:line="240" w:lineRule="auto"/>
-        <w:jc w:val="left"/>
-        <w:rPr>
-          <w:b/>
-          <w:sz w:val="36"/>
-          <w:szCs w:val="36"/>
-        </w:rPr>
-      </w:pPr>
-      <w:r>
-        <w:rPr>
-          <w:b/>
-          <w:sz w:val="36"/>
-          <w:szCs w:val="36"/>
-        </w:rPr>
-        <w:br w:type="page"/>
       </w:r>
     </w:p>
     <w:p>
@@ -5740,10 +4709,59 @@
           <w:tab w:val="left" w:pos="5544"/>
         </w:tabs>
         <w:ind w:right="-285"/>
+        <w:jc w:val="right"/>
         <w:rPr>
           <w:sz w:val="24"/>
         </w:rPr>
       </w:pPr>
+      <w:r>
+        <w:rPr>
+          <w:sz w:val="24"/>
+        </w:rPr>
+        <w:t>Giáo viên hướng dẫn ký, ghi rõ họ tên</w:t>
+      </w:r>
+    </w:p>
+    <w:p>
+      <w:pPr>
+        <w:tabs>
+          <w:tab w:val="left" w:pos="1694"/>
+          <w:tab w:val="left" w:pos="5544"/>
+        </w:tabs>
+        <w:ind w:right="-285"/>
+        <w:jc w:val="center"/>
+        <w:rPr>
+          <w:b/>
+          <w:sz w:val="32"/>
+          <w:szCs w:val="32"/>
+        </w:rPr>
+      </w:pPr>
+      <w:r>
+        <w:rPr>
+          <w:b/>
+          <w:sz w:val="32"/>
+          <w:szCs w:val="32"/>
+        </w:rPr>
+        <w:t>NHẬN XÉT CỦA HỘI ĐỒNG PHẢN BIỆN</w:t>
+      </w:r>
+    </w:p>
+    <w:p>
+      <w:pPr>
+        <w:tabs>
+          <w:tab w:val="left" w:pos="1694"/>
+          <w:tab w:val="left" w:pos="5544"/>
+        </w:tabs>
+        <w:ind w:right="-285"/>
+        <w:rPr>
+          <w:sz w:val="24"/>
+        </w:rPr>
+      </w:pPr>
+      <w:r>
+        <w:rPr>
+          <w:sz w:val="24"/>
+        </w:rPr>
+        <w:lastRenderedPageBreak/>
+        <w:t>……………………………………………………………………………………………………………………………………………………………………………………………………………………………………………………………………………………………………………………………………………………………………………………………………………………………………………………………………………………………………………………………………………………………………………………………………………………………………………………………………………………………………………………………………………………………………………………………………………………………………………………………………………………………………………………………………………………………………………………………………………………………………………………………………………………………………………………………………………………………………………………………………………………………………………………………………………………………………………………………………………………………………………………………………………………………………………………………………………………………………………………………………………………………………………………………………………………………………………………………………………………………………………………………………………………………………………………………………………………………………………………………………………………………………………………………………………………………………………………………………………………………………………………………………………………</w:t>
+      </w:r>
     </w:p>
     <w:p>
       <w:pPr>
@@ -5761,380 +4779,8 @@
         <w:rPr>
           <w:sz w:val="24"/>
         </w:rPr>
-        <w:t>Giáo viên hướng dẫn ký, ghi rõ họ tên</w:t>
-      </w:r>
-    </w:p>
-    <w:p>
-      <w:pPr>
-        <w:tabs>
-          <w:tab w:val="left" w:pos="1694"/>
-          <w:tab w:val="left" w:pos="5544"/>
-        </w:tabs>
-        <w:ind w:right="-285"/>
-        <w:rPr>
-          <w:sz w:val="24"/>
-        </w:rPr>
-      </w:pPr>
-    </w:p>
-    <w:p>
-      <w:pPr>
-        <w:tabs>
-          <w:tab w:val="left" w:pos="1694"/>
-          <w:tab w:val="left" w:pos="5544"/>
-        </w:tabs>
-        <w:ind w:right="-285"/>
-        <w:rPr>
-          <w:sz w:val="24"/>
-        </w:rPr>
-      </w:pPr>
-    </w:p>
-    <w:p>
-      <w:pPr>
-        <w:tabs>
-          <w:tab w:val="left" w:pos="1694"/>
-          <w:tab w:val="left" w:pos="5544"/>
-        </w:tabs>
-        <w:ind w:right="-285"/>
-        <w:rPr>
-          <w:sz w:val="24"/>
-        </w:rPr>
-      </w:pPr>
-    </w:p>
-    <w:p>
-      <w:pPr>
-        <w:tabs>
-          <w:tab w:val="left" w:pos="1694"/>
-          <w:tab w:val="left" w:pos="5544"/>
-        </w:tabs>
-        <w:ind w:right="-285"/>
-        <w:rPr>
-          <w:sz w:val="24"/>
-        </w:rPr>
-      </w:pPr>
-    </w:p>
-    <w:p>
-      <w:pPr>
-        <w:tabs>
-          <w:tab w:val="left" w:pos="1694"/>
-          <w:tab w:val="left" w:pos="5544"/>
-        </w:tabs>
-        <w:ind w:right="-285"/>
-        <w:rPr>
-          <w:sz w:val="24"/>
-        </w:rPr>
-      </w:pPr>
-    </w:p>
-    <w:p>
-      <w:pPr>
-        <w:tabs>
-          <w:tab w:val="left" w:pos="1694"/>
-          <w:tab w:val="left" w:pos="5544"/>
-        </w:tabs>
-        <w:ind w:right="-285"/>
-        <w:rPr>
-          <w:sz w:val="24"/>
-        </w:rPr>
-      </w:pPr>
-    </w:p>
-    <w:p>
-      <w:pPr>
-        <w:tabs>
-          <w:tab w:val="left" w:pos="1694"/>
-          <w:tab w:val="left" w:pos="5544"/>
-        </w:tabs>
-        <w:ind w:right="-285"/>
-        <w:rPr>
-          <w:sz w:val="24"/>
-        </w:rPr>
-      </w:pPr>
-    </w:p>
-    <w:p>
-      <w:pPr>
-        <w:tabs>
-          <w:tab w:val="left" w:pos="1694"/>
-          <w:tab w:val="left" w:pos="5544"/>
-        </w:tabs>
-        <w:ind w:right="-285"/>
-        <w:rPr>
-          <w:sz w:val="24"/>
-        </w:rPr>
-      </w:pPr>
-    </w:p>
-    <w:p>
-      <w:pPr>
-        <w:tabs>
-          <w:tab w:val="left" w:pos="1694"/>
-          <w:tab w:val="left" w:pos="5544"/>
-        </w:tabs>
-        <w:ind w:right="-285"/>
-        <w:rPr>
-          <w:sz w:val="24"/>
-        </w:rPr>
-      </w:pPr>
-    </w:p>
-    <w:p>
-      <w:pPr>
-        <w:tabs>
-          <w:tab w:val="left" w:pos="1694"/>
-          <w:tab w:val="left" w:pos="5544"/>
-        </w:tabs>
-        <w:ind w:right="-285"/>
-        <w:rPr>
-          <w:sz w:val="24"/>
-        </w:rPr>
-      </w:pPr>
-    </w:p>
-    <w:p>
-      <w:pPr>
-        <w:tabs>
-          <w:tab w:val="left" w:pos="1694"/>
-          <w:tab w:val="left" w:pos="5544"/>
-        </w:tabs>
-        <w:ind w:right="-285"/>
-        <w:rPr>
-          <w:sz w:val="24"/>
-        </w:rPr>
-      </w:pPr>
-    </w:p>
-    <w:p>
-      <w:pPr>
-        <w:tabs>
-          <w:tab w:val="left" w:pos="1694"/>
-          <w:tab w:val="left" w:pos="5544"/>
-        </w:tabs>
-        <w:ind w:right="-285"/>
-        <w:rPr>
-          <w:sz w:val="24"/>
-        </w:rPr>
-      </w:pPr>
-    </w:p>
-    <w:p>
-      <w:pPr>
-        <w:tabs>
-          <w:tab w:val="left" w:pos="1694"/>
-          <w:tab w:val="left" w:pos="5544"/>
-        </w:tabs>
-        <w:ind w:right="-285"/>
-        <w:jc w:val="center"/>
-        <w:rPr>
-          <w:b/>
-          <w:sz w:val="32"/>
-          <w:szCs w:val="32"/>
-        </w:rPr>
-      </w:pPr>
-      <w:r>
-        <w:rPr>
-          <w:b/>
-          <w:sz w:val="32"/>
-          <w:szCs w:val="32"/>
-        </w:rPr>
-        <w:t>NHẬN XÉT CỦA HỘI ĐỒNG PHẢN BIỆN</w:t>
-      </w:r>
-    </w:p>
-    <w:p>
-      <w:pPr>
-        <w:tabs>
-          <w:tab w:val="left" w:pos="1694"/>
-          <w:tab w:val="left" w:pos="5544"/>
-        </w:tabs>
-        <w:ind w:right="-285"/>
-        <w:rPr>
-          <w:sz w:val="24"/>
-        </w:rPr>
-      </w:pPr>
-      <w:r>
-        <w:rPr>
-          <w:sz w:val="24"/>
-        </w:rPr>
-        <w:lastRenderedPageBreak/>
-        <w:t>……………………………………………………………………………………………………………………………………………………………………………………………………………………………………………………………………………………………………………………………………………………………………………………………………………………………………………………………………………………………………………………………………………………………………………………………………………………………………………………………………………………………………………………………………………………………………………………………………………………………………………………………………………………………………………………………………………………………………………………………………………………………………………………………………………………………………………………………………………………………………………………………………………………………………………………………………………………………………………………………………………………………………………………………………………………………………………………………………………………………………………………………………………………………………………………………………………………………………………………………………………………………………………………………………………………………………………………………………………………………………………………………………………………………………………………………………………………………………………………………………………………………………………………………………………………</w:t>
-      </w:r>
-    </w:p>
-    <w:p>
-      <w:pPr>
-        <w:tabs>
-          <w:tab w:val="left" w:pos="1694"/>
-          <w:tab w:val="left" w:pos="5544"/>
-        </w:tabs>
-        <w:ind w:right="-285"/>
-        <w:jc w:val="center"/>
-        <w:rPr>
-          <w:b/>
-          <w:sz w:val="24"/>
-        </w:rPr>
-      </w:pPr>
-    </w:p>
-    <w:p>
-      <w:pPr>
-        <w:tabs>
-          <w:tab w:val="left" w:pos="1694"/>
-          <w:tab w:val="left" w:pos="5544"/>
-        </w:tabs>
-        <w:ind w:right="-285"/>
-        <w:jc w:val="right"/>
-        <w:rPr>
-          <w:sz w:val="24"/>
-        </w:rPr>
-      </w:pPr>
-      <w:r>
-        <w:rPr>
-          <w:sz w:val="24"/>
-        </w:rPr>
         <w:t>HĐ phản biện ký, ghi rõ họ tên</w:t>
       </w:r>
-    </w:p>
-    <w:p>
-      <w:pPr>
-        <w:tabs>
-          <w:tab w:val="left" w:pos="1694"/>
-          <w:tab w:val="left" w:pos="5544"/>
-        </w:tabs>
-        <w:ind w:right="-285"/>
-        <w:jc w:val="right"/>
-        <w:rPr>
-          <w:sz w:val="24"/>
-        </w:rPr>
-      </w:pPr>
-    </w:p>
-    <w:p>
-      <w:pPr>
-        <w:tabs>
-          <w:tab w:val="left" w:pos="1694"/>
-          <w:tab w:val="left" w:pos="5544"/>
-        </w:tabs>
-        <w:ind w:right="-285"/>
-        <w:jc w:val="right"/>
-        <w:rPr>
-          <w:sz w:val="24"/>
-        </w:rPr>
-      </w:pPr>
-    </w:p>
-    <w:p>
-      <w:pPr>
-        <w:tabs>
-          <w:tab w:val="left" w:pos="1694"/>
-          <w:tab w:val="left" w:pos="5544"/>
-        </w:tabs>
-        <w:ind w:right="-285"/>
-        <w:jc w:val="right"/>
-        <w:rPr>
-          <w:sz w:val="24"/>
-        </w:rPr>
-      </w:pPr>
-    </w:p>
-    <w:p>
-      <w:pPr>
-        <w:tabs>
-          <w:tab w:val="left" w:pos="1694"/>
-          <w:tab w:val="left" w:pos="5544"/>
-        </w:tabs>
-        <w:ind w:right="-285"/>
-        <w:jc w:val="right"/>
-        <w:rPr>
-          <w:sz w:val="24"/>
-        </w:rPr>
-      </w:pPr>
-    </w:p>
-    <w:p>
-      <w:pPr>
-        <w:tabs>
-          <w:tab w:val="left" w:pos="1694"/>
-          <w:tab w:val="left" w:pos="5544"/>
-        </w:tabs>
-        <w:ind w:right="-285"/>
-        <w:jc w:val="right"/>
-        <w:rPr>
-          <w:sz w:val="24"/>
-        </w:rPr>
-      </w:pPr>
-    </w:p>
-    <w:p>
-      <w:pPr>
-        <w:tabs>
-          <w:tab w:val="left" w:pos="1694"/>
-          <w:tab w:val="left" w:pos="5544"/>
-        </w:tabs>
-        <w:ind w:right="-285"/>
-        <w:jc w:val="right"/>
-        <w:rPr>
-          <w:sz w:val="24"/>
-        </w:rPr>
-      </w:pPr>
-    </w:p>
-    <w:p>
-      <w:pPr>
-        <w:tabs>
-          <w:tab w:val="left" w:pos="1694"/>
-          <w:tab w:val="left" w:pos="5544"/>
-        </w:tabs>
-        <w:ind w:right="-285"/>
-        <w:jc w:val="right"/>
-        <w:rPr>
-          <w:sz w:val="24"/>
-        </w:rPr>
-      </w:pPr>
-    </w:p>
-    <w:p>
-      <w:pPr>
-        <w:tabs>
-          <w:tab w:val="left" w:pos="1694"/>
-          <w:tab w:val="left" w:pos="5544"/>
-        </w:tabs>
-        <w:ind w:right="-285"/>
-        <w:jc w:val="right"/>
-        <w:rPr>
-          <w:sz w:val="24"/>
-        </w:rPr>
-      </w:pPr>
-    </w:p>
-    <w:p>
-      <w:pPr>
-        <w:tabs>
-          <w:tab w:val="left" w:pos="1694"/>
-          <w:tab w:val="left" w:pos="5544"/>
-        </w:tabs>
-        <w:ind w:right="-285"/>
-        <w:jc w:val="right"/>
-        <w:rPr>
-          <w:sz w:val="24"/>
-        </w:rPr>
-      </w:pPr>
-    </w:p>
-    <w:p>
-      <w:pPr>
-        <w:tabs>
-          <w:tab w:val="left" w:pos="1694"/>
-          <w:tab w:val="left" w:pos="5544"/>
-        </w:tabs>
-        <w:ind w:right="-285"/>
-        <w:rPr>
-          <w:sz w:val="24"/>
-        </w:rPr>
-      </w:pPr>
-    </w:p>
-    <w:p>
-      <w:pPr>
-        <w:tabs>
-          <w:tab w:val="left" w:pos="1694"/>
-          <w:tab w:val="left" w:pos="5544"/>
-        </w:tabs>
-        <w:ind w:right="-285"/>
-        <w:rPr>
-          <w:sz w:val="24"/>
-        </w:rPr>
-      </w:pPr>
-    </w:p>
-    <w:p>
-      <w:pPr>
-        <w:tabs>
-          <w:tab w:val="left" w:pos="1694"/>
-          <w:tab w:val="left" w:pos="5544"/>
-        </w:tabs>
-        <w:ind w:right="-285"/>
-        <w:rPr>
-          <w:sz w:val="24"/>
-        </w:rPr>
-      </w:pPr>
     </w:p>
     <w:p>
       <w:pPr>
@@ -6430,88 +5076,27 @@
       </w:r>
     </w:p>
     <w:p>
-      <w:pPr>
-        <w:ind w:right="-285"/>
-        <w:rPr>
-          <w:bCs/>
-          <w:szCs w:val="26"/>
-        </w:rPr>
-      </w:pPr>
-      <w:r>
-        <w:rPr>
-          <w:bCs/>
-          <w:szCs w:val="26"/>
-        </w:rPr>
-        <w:t>Đây là chương trọng tâm thể hiện kỹ năng “xử lý thô” và tối ưu hóa hệ thống.</w:t>
+      <w:pPr/>
+      <w:r>
+        <w:t>Đây là chương trọng tâm thể hiện năng lực xây dựng một pipeline dữ liệu hoàn chỉnh, từ việc tích hợp nhiều bảng có quan hệ đến việc làm sạch và kiểm soát chất lượng dữ liệu trước khi đưa vào phân tích và huấn luyện mô hình.</w:t>
       </w:r>
     </w:p>
     <w:p>
-      <w:pPr>
-        <w:numPr>
-          <w:ilvl w:val="0"/>
-          <w:numId w:val="1"/>
-        </w:numPr>
-        <w:tabs>
-          <w:tab w:val="clear" w:pos="420"/>
-        </w:tabs>
-        <w:ind w:right="-285"/>
-        <w:rPr>
-          <w:bCs/>
-          <w:szCs w:val="26"/>
-        </w:rPr>
-      </w:pPr>
-      <w:r>
-        <w:rPr>
-          <w:bCs/>
-          <w:szCs w:val="26"/>
-        </w:rPr>
-        <w:t xml:space="preserve">Quy trình tích hợp: Mô tả kỹ thuật Merge/Join các bảng; cách giải quyết xung đột khóa và tối ưu bộ nhớ khi xử lý hàng triệu dòng. </w:t>
+      <w:pPr/>
+      <w:r>
+        <w:t>2.1. Quy trình tích hợp dữ liệu: Dữ liệu được thu thập từ nhiều bảng khác nhau, trong đó bảng application_train là bảng trung tâm và các bảng phụ như bureau, previous_application, installments_payments, POS_CASH_balance, credit_card_balance cung cấp thông tin lịch sử tín dụng của khách hàng. Vì số lượng dòng lớn và dữ liệu phân tán trên nhiều bảng, nhóm đã thiết kế pipeline theo hướng phân tầng, trong đó các bảng phụ được tổng hợp trước ở mức khách hàng rồi mới nối vào bảng chính bằng phép LEFT JOIN để tạo thành bảng application_flat. Cách làm này giúp giảm tải cho môi trường tính toán, tối ưu bộ nhớ và giữ được tính nhất quán của dữ liệu.</w:t>
       </w:r>
     </w:p>
     <w:p>
-      <w:pPr>
-        <w:numPr>
-          <w:ilvl w:val="0"/>
-          <w:numId w:val="1"/>
-        </w:numPr>
-        <w:tabs>
-          <w:tab w:val="clear" w:pos="420"/>
-        </w:tabs>
-        <w:ind w:right="-285"/>
-        <w:rPr>
-          <w:bCs/>
-          <w:szCs w:val="26"/>
-        </w:rPr>
-      </w:pPr>
-      <w:r>
-        <w:rPr>
-          <w:bCs/>
-          <w:szCs w:val="26"/>
-        </w:rPr>
-        <w:t>Làm sạch dữ liệu chuyên sâu: Quy trình xử lý Outliers và Imputation cho dữ liệu khuyết thiếu.</w:t>
+      <w:pPr/>
+      <w:r>
+        <w:t>2.2. Làm sạch dữ liệu chuyên sâu: Sau khi tích hợp dữ liệu, nhóm thực hiện xử lý các vấn đề về khuyết thiếu, giá trị sai logic và outlier. Không phải giá trị thiếu nào cũng là lỗi; với các biến từ bảng phụ, nhiều giá trị NULL phản ánh đúng thực tế rằng khách hàng chưa từng có lịch sử tương ứng. Vì vậy, nhóm không áp dụng cách điền giá trị trung bình hoặc trung vị một cách máy móc mà phân nhóm và xử lý theo ngữ cảnh nghiệp vụ. Với các biến tiền tệ và các đặc trưng lịch sử, nhóm cũng áp dụng các phép biến đổi như cắt theo phân vị hoặc log-transform để giảm ảnh hưởng của outlier mà vẫn giữ được ý nghĩa thực tế của dữ liệu.</w:t>
       </w:r>
     </w:p>
     <w:p>
-      <w:pPr>
-        <w:numPr>
-          <w:ilvl w:val="0"/>
-          <w:numId w:val="1"/>
-        </w:numPr>
-        <w:tabs>
-          <w:tab w:val="clear" w:pos="420"/>
-        </w:tabs>
-        <w:ind w:right="-285"/>
-        <w:rPr>
-          <w:bCs/>
-          <w:szCs w:val="26"/>
-        </w:rPr>
-      </w:pPr>
-      <w:r>
-        <w:rPr>
-          <w:bCs/>
-          <w:szCs w:val="26"/>
-        </w:rPr>
-        <w:t>Kịch bản kiểm thử dữ liệu: Các bước Unit test để đảm bảo dữ liệu sau khi Join không bị sai lệch số liệu gốc.</w:t>
+      <w:pPr/>
+      <w:r>
+        <w:t>2.3. Kiểm thử dữ liệu và kiểm soát chất lượng: Một phần quan trọng của pipeline là kiểm tra chất lượng dữ liệu sau mỗi bước biến đổi. Nhóm đã xây dựng các kịch bản kiểm thử để xác minh số dòng, số cột, tính duy nhất của khóa khách hàng, kiểu dữ liệu và việc loại bỏ các giá trị sai logic. Việc này giúp phát hiện sớm các lỗi trong join, aggregate hoặc chuyển đổi dữ liệu, tránh để sai lệch bị kéo dài vào các bước phân tích và mô hình hóa sau này. Đây là yếu tố then chốt để đảm bảo dữ liệu đầu vào có chất lượng cao và có thể tin cậy cho việc dự báo rủi ro tín dụng.</w:t>
       </w:r>
     </w:p>
     <w:p>

</xml_diff>